<commit_message>
ajuste roteiro de testes
</commit_message>
<xml_diff>
--- a/roteiro-de-testes.docx
+++ b/roteiro-de-testes.docx
@@ -32,7 +32,7 @@
     <w:p>
       <w:r>
         <w:pict w14:anchorId="5C27D7CF">
-          <v:rect id="_x0000_i1103" style="width:0;height:1.5pt" o:hralign="center" o:hrstd="t" o:hr="t" fillcolor="#a0a0a0" stroked="f"/>
+          <v:rect id="_x0000_i1025" style="width:0;height:1.5pt" o:hralign="center" o:hrstd="t" o:hr="t" fillcolor="#a0a0a0" stroked="f"/>
         </w:pict>
       </w:r>
     </w:p>
@@ -59,6 +59,33 @@
         </w:numPr>
       </w:pPr>
       <w:r>
+        <w:t xml:space="preserve">Acessar a aplicação: </w:t>
+      </w:r>
+      <w:hyperlink r:id="rId5" w:history="1">
+        <w:r>
+          <w:rPr>
+            <w:rStyle w:val="Hyperlink"/>
+          </w:rPr>
+          <w:t>https://webcraft-ai-0wkz.onrender.com/</w:t>
+        </w:r>
+      </w:hyperlink>
+    </w:p>
+    <w:p>
+      <w:pPr>
+        <w:ind w:left="720"/>
+      </w:pPr>
+      <w:r>
+        <w:t>(Caso a aplicação não apareça, esperar alguns minutos para carregar)</w:t>
+      </w:r>
+    </w:p>
+    <w:p>
+      <w:pPr>
+        <w:numPr>
+          <w:ilvl w:val="0"/>
+          <w:numId w:val="2"/>
+        </w:numPr>
+      </w:pPr>
+      <w:r>
         <w:t>Inserção do prompt → 2. Geração de tela → 3. Visualização/Preview → 4.</w:t>
       </w:r>
       <w:r>
@@ -77,7 +104,7 @@
     <w:p>
       <w:r>
         <w:pict w14:anchorId="7F8F1742">
-          <v:rect id="_x0000_i1104" style="width:0;height:1.5pt" o:hralign="center" o:hrstd="t" o:hr="t" fillcolor="#a0a0a0" stroked="f"/>
+          <v:rect id="_x0000_i1026" style="width:0;height:1.5pt" o:hralign="center" o:hrstd="t" o:hr="t" fillcolor="#a0a0a0" stroked="f"/>
         </w:pict>
       </w:r>
     </w:p>
@@ -368,6 +395,7 @@
           <w:b/>
           <w:bCs/>
         </w:rPr>
+        <w:lastRenderedPageBreak/>
         <w:t>Modal simples</w:t>
       </w:r>
       <w:r>
@@ -391,7 +419,6 @@
         </w:numPr>
       </w:pPr>
       <w:r>
-        <w:lastRenderedPageBreak/>
         <w:t>Mensagens/estados vazios em componentes (quando contemplado).</w:t>
       </w:r>
     </w:p>
@@ -578,7 +605,7 @@
     <w:p>
       <w:r>
         <w:pict w14:anchorId="2F7C30DE">
-          <v:rect id="_x0000_i1105" style="width:0;height:1.5pt" o:hralign="center" o:hrstd="t" o:hr="t" fillcolor="#a0a0a0" stroked="f"/>
+          <v:rect id="_x0000_i1027" style="width:0;height:1.5pt" o:hralign="center" o:hrstd="t" o:hr="t" fillcolor="#a0a0a0" stroked="f"/>
         </w:pict>
       </w:r>
     </w:p>
@@ -753,7 +780,7 @@
     <w:p>
       <w:r>
         <w:pict w14:anchorId="4A6B9215">
-          <v:rect id="_x0000_i1106" style="width:0;height:1.5pt" o:hralign="center" o:hrstd="t" o:hr="t" fillcolor="#a0a0a0" stroked="f"/>
+          <v:rect id="_x0000_i1028" style="width:0;height:1.5pt" o:hralign="center" o:hrstd="t" o:hr="t" fillcolor="#a0a0a0" stroked="f"/>
         </w:pict>
       </w:r>
     </w:p>
@@ -851,6 +878,7 @@
           <w:b/>
           <w:bCs/>
         </w:rPr>
+        <w:lastRenderedPageBreak/>
         <w:t>Responsividade básica</w:t>
       </w:r>
       <w:r>
@@ -869,7 +897,6 @@
           <w:b/>
           <w:bCs/>
         </w:rPr>
-        <w:lastRenderedPageBreak/>
         <w:t>Interações simples</w:t>
       </w:r>
       <w:r>
@@ -931,7 +958,7 @@
     <w:p>
       <w:r>
         <w:pict w14:anchorId="1BD01CE0">
-          <v:rect id="_x0000_i1107" style="width:0;height:1.5pt" o:hralign="center" o:hrstd="t" o:hr="t" fillcolor="#a0a0a0" stroked="f"/>
+          <v:rect id="_x0000_i1029" style="width:0;height:1.5pt" o:hralign="center" o:hrstd="t" o:hr="t" fillcolor="#a0a0a0" stroked="f"/>
         </w:pict>
       </w:r>
     </w:p>
@@ -1016,7 +1043,7 @@
     <w:p>
       <w:r>
         <w:pict w14:anchorId="19F090C6">
-          <v:rect id="_x0000_i1108" style="width:0;height:1.5pt" o:hralign="center" o:hrstd="t" o:hr="t" fillcolor="#a0a0a0" stroked="f"/>
+          <v:rect id="_x0000_i1030" style="width:0;height:1.5pt" o:hralign="center" o:hrstd="t" o:hr="t" fillcolor="#a0a0a0" stroked="f"/>
         </w:pict>
       </w:r>
     </w:p>
@@ -1195,7 +1222,7 @@
     <w:p>
       <w:r>
         <w:pict w14:anchorId="75B60431">
-          <v:rect id="_x0000_i1139" style="width:0;height:1.5pt" o:hralign="center" o:hrstd="t" o:hr="t" fillcolor="#a0a0a0" stroked="f"/>
+          <v:rect id="_x0000_i1031" style="width:0;height:1.5pt" o:hralign="center" o:hrstd="t" o:hr="t" fillcolor="#a0a0a0" stroked="f"/>
         </w:pict>
       </w:r>
     </w:p>
@@ -1230,10 +1257,7 @@
         <w:t>C</w:t>
       </w:r>
       <w:r>
-        <w:t>rie uma tela de login com campos de usuario e senha, botão 'Entrar' e hyperlink com opção de 'Esqueci minha senha'</w:t>
-      </w:r>
-      <w:r>
-        <w:t>”</w:t>
+        <w:t>rie uma tela de login com campos de usuario e senha, botão 'Entrar' e hyperlink com opção de 'Esqueci minha senha'”</w:t>
       </w:r>
     </w:p>
     <w:p>
@@ -1324,6 +1348,7 @@
         <w:spacing w:before="240"/>
       </w:pPr>
       <w:r>
+        <w:lastRenderedPageBreak/>
         <w:t>“</w:t>
       </w:r>
       <w:r>
@@ -5774,6 +5799,7 @@
   <w:style w:type="character" w:default="1" w:styleId="Fontepargpadro">
     <w:name w:val="Default Paragraph Font"/>
     <w:uiPriority w:val="1"/>
+    <w:semiHidden/>
     <w:unhideWhenUsed/>
   </w:style>
   <w:style w:type="table" w:default="1" w:styleId="Tabelanormal">
@@ -6117,6 +6143,29 @@
       <w:szCs w:val="20"/>
     </w:rPr>
   </w:style>
+  <w:style w:type="character" w:styleId="Hyperlink">
+    <w:name w:val="Hyperlink"/>
+    <w:basedOn w:val="Fontepargpadro"/>
+    <w:uiPriority w:val="99"/>
+    <w:unhideWhenUsed/>
+    <w:rsid w:val="00F14970"/>
+    <w:rPr>
+      <w:color w:val="467886" w:themeColor="hyperlink"/>
+      <w:u w:val="single"/>
+    </w:rPr>
+  </w:style>
+  <w:style w:type="character" w:styleId="MenoPendente">
+    <w:name w:val="Unresolved Mention"/>
+    <w:basedOn w:val="Fontepargpadro"/>
+    <w:uiPriority w:val="99"/>
+    <w:semiHidden/>
+    <w:unhideWhenUsed/>
+    <w:rsid w:val="00F14970"/>
+    <w:rPr>
+      <w:color w:val="605E5C"/>
+      <w:shd w:val="clear" w:color="auto" w:fill="E1DFDD"/>
+    </w:rPr>
+  </w:style>
 </w:styles>
 </file>
 

</xml_diff>

<commit_message>
botão limpar tela de preview adicionado
</commit_message>
<xml_diff>
--- a/roteiro-de-testes.docx
+++ b/roteiro-de-testes.docx
@@ -98,7 +98,16 @@
         <w:t xml:space="preserve"> </w:t>
       </w:r>
       <w:r>
-        <w:t>/Exportar código.</w:t>
+        <w:t>/Exportar código</w:t>
+      </w:r>
+      <w:r>
+        <w:t xml:space="preserve"> </w:t>
+      </w:r>
+      <w:r>
+        <w:t>→</w:t>
+      </w:r>
+      <w:r>
+        <w:t xml:space="preserve"> 5. Limpar tela</w:t>
       </w:r>
     </w:p>
     <w:p>
@@ -953,6 +962,27 @@
       </w:r>
       <w:r>
         <w:t>: copiar/baixar entrega HTML/CSS/JS coerentes com o preview.</w:t>
+      </w:r>
+    </w:p>
+    <w:p>
+      <w:pPr>
+        <w:numPr>
+          <w:ilvl w:val="0"/>
+          <w:numId w:val="11"/>
+        </w:numPr>
+      </w:pPr>
+      <w:r>
+        <w:rPr>
+          <w:b/>
+          <w:bCs/>
+        </w:rPr>
+        <w:t>Limpar</w:t>
+      </w:r>
+      <w:r>
+        <w:t>:</w:t>
+      </w:r>
+      <w:r>
+        <w:t xml:space="preserve"> opção de limpar a tela de preview</w:t>
       </w:r>
     </w:p>
     <w:p>
@@ -1348,7 +1378,6 @@
         <w:spacing w:before="240"/>
       </w:pPr>
       <w:r>
-        <w:lastRenderedPageBreak/>
         <w:t>“</w:t>
       </w:r>
       <w:r>

</xml_diff>